<commit_message>
Cover letter: authors Luis, Adriana, Caio, Stella
Co-Authored-By: Claude Opus 5.5 <noreply@anthropic.com>
Claude-Session: https://claude.ai/code/session_01RKBYJsspEG8XXPu9eJdzD5
</commit_message>
<xml_diff>
--- a/Psicologia em Pesquisa/AGEM - PeP - Carta de apresentacao.docx
+++ b/Psicologia em Pesquisa/AGEM - PeP - Carta de apresentacao.docx
@@ -89,6 +89,22 @@
           <w:sz w:val="24"/>
           <w:szCs w:val="24"/>
         </w:rPr>
+        <w:t xml:space="preserve">Luis Anunciação (ORCID 0000-0001-5303-5782). Doutor (PhD); Professor do Departamento de Psicologia, Pontifícia Universidade Católica do Rio de Janeiro (PUC-Rio), Rio de Janeiro, RJ, Brasil; Courtesy Professor, Center on Human Development, University of Oregon, Eugene, OR, Estados Unidos.</w:t>
+      </w:r>
+    </w:p>
+    <w:p>
+      <w:pPr>
+        <w:spacing w:after="120" w:line="360"/>
+        <w:jc w:val="both"/>
+      </w:pPr>
+      <w:r>
+        <w:rPr>
+          <w:rFonts w:ascii="Times New Roman" w:cs="Times New Roman" w:eastAsia="Times New Roman" w:hAnsi="Times New Roman"/>
+          <w:b w:val="false"/>
+          <w:bCs w:val="false"/>
+          <w:sz w:val="24"/>
+          <w:szCs w:val="24"/>
+        </w:rPr>
         <w:t xml:space="preserve">Adriana Tomaz Lima (ORCID 0009-0000-4436-4461). Psicóloga; mestranda em Educação, Programa Educação Sem Fronteiras (PESF), Pontifícia Universidade Católica do Rio de Janeiro (PUC-Rio), Rio de Janeiro, RJ, Brasil.</w:t>
       </w:r>
     </w:p>
@@ -105,7 +121,7 @@
           <w:sz w:val="24"/>
           <w:szCs w:val="24"/>
         </w:rPr>
-        <w:t xml:space="preserve">Diego Haas. Graduando em Psicologia; aluno de Iniciação Científica, Laboratório de Métodos Quantitativos e Psicometria, Pontifícia Universidade Católica do Rio de Janeiro (PUC-Rio), Rio de Janeiro, RJ, Brasil.</w:t>
+        <w:t xml:space="preserve">Caio Barreto. Aluno de graduação; aluno de Iniciação Científica, Laboratório de Métodos Quantitativos e Psicometria, Pontifícia Universidade Católica do Rio de Janeiro (PUC-Rio), Rio de Janeiro, RJ, Brasil.</w:t>
       </w:r>
     </w:p>
     <w:p>
@@ -122,54 +138,6 @@
           <w:szCs w:val="24"/>
         </w:rPr>
         <w:t xml:space="preserve">Stella Torreão (ORCID 0009-0002-0507-5952). Graduanda em Neurociências; aluna de Iniciação Científica, Laboratório de Métodos Quantitativos e Psicometria, Pontifícia Universidade Católica do Rio de Janeiro (PUC-Rio), Rio de Janeiro, RJ, Brasil.</w:t>
-      </w:r>
-    </w:p>
-    <w:p>
-      <w:pPr>
-        <w:spacing w:after="120" w:line="360"/>
-        <w:jc w:val="both"/>
-      </w:pPr>
-      <w:r>
-        <w:rPr>
-          <w:rFonts w:ascii="Times New Roman" w:cs="Times New Roman" w:eastAsia="Times New Roman" w:hAnsi="Times New Roman"/>
-          <w:b w:val="false"/>
-          <w:bCs w:val="false"/>
-          <w:sz w:val="24"/>
-          <w:szCs w:val="24"/>
-        </w:rPr>
-        <w:t xml:space="preserve">Hanni Schiffer (ORCID 0009-0006-2505-2992). Graduanda em Neurociências; aluna de Iniciação Científica, Laboratório de Métodos Quantitativos e Psicometria, Pontifícia Universidade Católica do Rio de Janeiro (PUC-Rio), Rio de Janeiro, RJ, Brasil.</w:t>
-      </w:r>
-    </w:p>
-    <w:p>
-      <w:pPr>
-        <w:spacing w:after="120" w:line="360"/>
-        <w:jc w:val="both"/>
-      </w:pPr>
-      <w:r>
-        <w:rPr>
-          <w:rFonts w:ascii="Times New Roman" w:cs="Times New Roman" w:eastAsia="Times New Roman" w:hAnsi="Times New Roman"/>
-          <w:b w:val="false"/>
-          <w:bCs w:val="false"/>
-          <w:sz w:val="24"/>
-          <w:szCs w:val="24"/>
-        </w:rPr>
-        <w:t xml:space="preserve">Caio Barreto. Aluno de graduação; aluno de Iniciação Científica, Laboratório de Métodos Quantitativos e Psicometria, Pontifícia Universidade Católica do Rio de Janeiro (PUC-Rio), Rio de Janeiro, RJ, Brasil.</w:t>
-      </w:r>
-    </w:p>
-    <w:p>
-      <w:pPr>
-        <w:spacing w:after="120" w:line="360"/>
-        <w:jc w:val="both"/>
-      </w:pPr>
-      <w:r>
-        <w:rPr>
-          <w:rFonts w:ascii="Times New Roman" w:cs="Times New Roman" w:eastAsia="Times New Roman" w:hAnsi="Times New Roman"/>
-          <w:b w:val="false"/>
-          <w:bCs w:val="false"/>
-          <w:sz w:val="24"/>
-          <w:szCs w:val="24"/>
-        </w:rPr>
-        <w:t xml:space="preserve">Luis Anunciação (ORCID 0000-0001-5303-5782). Doutor (PhD); Professor do Departamento de Psicologia, Pontifícia Universidade Católica do Rio de Janeiro (PUC-Rio), Rio de Janeiro, RJ, Brasil; Courtesy Professor, Center on Human Development, University of Oregon, Eugene, OR, Estados Unidos.</w:t>
       </w:r>
     </w:p>
     <w:p>
@@ -289,7 +257,7 @@
           <w:sz w:val="24"/>
           <w:szCs w:val="24"/>
         </w:rPr>
-        <w:t xml:space="preserve"> A pesquisa não recebeu financiamento específico. Caio Barreto, Diego Haas, Hanni Schiffer e Stella Torreão são bolsistas de Iniciação Científica do Conselho Nacional de Desenvolvimento Científico e Tecnológico (CNPq), processo 406199/2025-6. Os autores declaram não haver conflitos de interesse.</w:t>
+        <w:t xml:space="preserve"> A pesquisa não recebeu financiamento específico. Caio Barreto e Stella Torreão são bolsistas de Iniciação Científica do Conselho Nacional de Desenvolvimento Científico e Tecnológico (CNPq), processo 406199/2025-6. Os autores declaram não haver conflitos de interesse.</w:t>
       </w:r>
     </w:p>
     <w:p>
@@ -431,6 +399,54 @@
           <w:sz w:val="24"/>
           <w:szCs w:val="24"/>
         </w:rPr>
+        <w:t xml:space="preserve">Luis Anunciação</w:t>
+      </w:r>
+    </w:p>
+    <w:p>
+      <w:pPr>
+        <w:spacing w:after="120" w:line="360"/>
+        <w:jc w:val="left"/>
+      </w:pPr>
+      <w:r>
+        <w:rPr>
+          <w:rFonts w:ascii="Times New Roman" w:cs="Times New Roman" w:eastAsia="Times New Roman" w:hAnsi="Times New Roman"/>
+          <w:b w:val="false"/>
+          <w:bCs w:val="false"/>
+          <w:sz w:val="24"/>
+          <w:szCs w:val="24"/>
+        </w:rPr>
+        <w:t xml:space="preserve"> </w:t>
+      </w:r>
+    </w:p>
+    <w:p>
+      <w:pPr>
+        <w:spacing w:after="120" w:line="360"/>
+        <w:jc w:val="left"/>
+      </w:pPr>
+      <w:r>
+        <w:rPr>
+          <w:rFonts w:ascii="Times New Roman" w:cs="Times New Roman" w:eastAsia="Times New Roman" w:hAnsi="Times New Roman"/>
+          <w:b w:val="false"/>
+          <w:bCs w:val="false"/>
+          <w:sz w:val="24"/>
+          <w:szCs w:val="24"/>
+        </w:rPr>
+        <w:t xml:space="preserve">______________________________________</w:t>
+      </w:r>
+    </w:p>
+    <w:p>
+      <w:pPr>
+        <w:spacing w:after="120" w:line="360"/>
+        <w:jc w:val="left"/>
+      </w:pPr>
+      <w:r>
+        <w:rPr>
+          <w:rFonts w:ascii="Times New Roman" w:cs="Times New Roman" w:eastAsia="Times New Roman" w:hAnsi="Times New Roman"/>
+          <w:b w:val="false"/>
+          <w:bCs w:val="false"/>
+          <w:sz w:val="24"/>
+          <w:szCs w:val="24"/>
+        </w:rPr>
         <w:t xml:space="preserve">Adriana Tomaz Lima</w:t>
       </w:r>
     </w:p>
@@ -479,7 +495,7 @@
           <w:sz w:val="24"/>
           <w:szCs w:val="24"/>
         </w:rPr>
-        <w:t xml:space="preserve">Diego Haas</w:t>
+        <w:t xml:space="preserve">Caio Barreto</w:t>
       </w:r>
     </w:p>
     <w:p>
@@ -528,150 +544,6 @@
           <w:szCs w:val="24"/>
         </w:rPr>
         <w:t xml:space="preserve">Stella Torreão</w:t>
-      </w:r>
-    </w:p>
-    <w:p>
-      <w:pPr>
-        <w:spacing w:after="120" w:line="360"/>
-        <w:jc w:val="left"/>
-      </w:pPr>
-      <w:r>
-        <w:rPr>
-          <w:rFonts w:ascii="Times New Roman" w:cs="Times New Roman" w:eastAsia="Times New Roman" w:hAnsi="Times New Roman"/>
-          <w:b w:val="false"/>
-          <w:bCs w:val="false"/>
-          <w:sz w:val="24"/>
-          <w:szCs w:val="24"/>
-        </w:rPr>
-        <w:t xml:space="preserve"> </w:t>
-      </w:r>
-    </w:p>
-    <w:p>
-      <w:pPr>
-        <w:spacing w:after="120" w:line="360"/>
-        <w:jc w:val="left"/>
-      </w:pPr>
-      <w:r>
-        <w:rPr>
-          <w:rFonts w:ascii="Times New Roman" w:cs="Times New Roman" w:eastAsia="Times New Roman" w:hAnsi="Times New Roman"/>
-          <w:b w:val="false"/>
-          <w:bCs w:val="false"/>
-          <w:sz w:val="24"/>
-          <w:szCs w:val="24"/>
-        </w:rPr>
-        <w:t xml:space="preserve">______________________________________</w:t>
-      </w:r>
-    </w:p>
-    <w:p>
-      <w:pPr>
-        <w:spacing w:after="120" w:line="360"/>
-        <w:jc w:val="left"/>
-      </w:pPr>
-      <w:r>
-        <w:rPr>
-          <w:rFonts w:ascii="Times New Roman" w:cs="Times New Roman" w:eastAsia="Times New Roman" w:hAnsi="Times New Roman"/>
-          <w:b w:val="false"/>
-          <w:bCs w:val="false"/>
-          <w:sz w:val="24"/>
-          <w:szCs w:val="24"/>
-        </w:rPr>
-        <w:t xml:space="preserve">Hanni Schiffer</w:t>
-      </w:r>
-    </w:p>
-    <w:p>
-      <w:pPr>
-        <w:spacing w:after="120" w:line="360"/>
-        <w:jc w:val="left"/>
-      </w:pPr>
-      <w:r>
-        <w:rPr>
-          <w:rFonts w:ascii="Times New Roman" w:cs="Times New Roman" w:eastAsia="Times New Roman" w:hAnsi="Times New Roman"/>
-          <w:b w:val="false"/>
-          <w:bCs w:val="false"/>
-          <w:sz w:val="24"/>
-          <w:szCs w:val="24"/>
-        </w:rPr>
-        <w:t xml:space="preserve"> </w:t>
-      </w:r>
-    </w:p>
-    <w:p>
-      <w:pPr>
-        <w:spacing w:after="120" w:line="360"/>
-        <w:jc w:val="left"/>
-      </w:pPr>
-      <w:r>
-        <w:rPr>
-          <w:rFonts w:ascii="Times New Roman" w:cs="Times New Roman" w:eastAsia="Times New Roman" w:hAnsi="Times New Roman"/>
-          <w:b w:val="false"/>
-          <w:bCs w:val="false"/>
-          <w:sz w:val="24"/>
-          <w:szCs w:val="24"/>
-        </w:rPr>
-        <w:t xml:space="preserve">______________________________________</w:t>
-      </w:r>
-    </w:p>
-    <w:p>
-      <w:pPr>
-        <w:spacing w:after="120" w:line="360"/>
-        <w:jc w:val="left"/>
-      </w:pPr>
-      <w:r>
-        <w:rPr>
-          <w:rFonts w:ascii="Times New Roman" w:cs="Times New Roman" w:eastAsia="Times New Roman" w:hAnsi="Times New Roman"/>
-          <w:b w:val="false"/>
-          <w:bCs w:val="false"/>
-          <w:sz w:val="24"/>
-          <w:szCs w:val="24"/>
-        </w:rPr>
-        <w:t xml:space="preserve">Caio Barreto</w:t>
-      </w:r>
-    </w:p>
-    <w:p>
-      <w:pPr>
-        <w:spacing w:after="120" w:line="360"/>
-        <w:jc w:val="left"/>
-      </w:pPr>
-      <w:r>
-        <w:rPr>
-          <w:rFonts w:ascii="Times New Roman" w:cs="Times New Roman" w:eastAsia="Times New Roman" w:hAnsi="Times New Roman"/>
-          <w:b w:val="false"/>
-          <w:bCs w:val="false"/>
-          <w:sz w:val="24"/>
-          <w:szCs w:val="24"/>
-        </w:rPr>
-        <w:t xml:space="preserve"> </w:t>
-      </w:r>
-    </w:p>
-    <w:p>
-      <w:pPr>
-        <w:spacing w:after="120" w:line="360"/>
-        <w:jc w:val="left"/>
-      </w:pPr>
-      <w:r>
-        <w:rPr>
-          <w:rFonts w:ascii="Times New Roman" w:cs="Times New Roman" w:eastAsia="Times New Roman" w:hAnsi="Times New Roman"/>
-          <w:b w:val="false"/>
-          <w:bCs w:val="false"/>
-          <w:sz w:val="24"/>
-          <w:szCs w:val="24"/>
-        </w:rPr>
-        <w:t xml:space="preserve">______________________________________</w:t>
-      </w:r>
-    </w:p>
-    <w:p>
-      <w:pPr>
-        <w:spacing w:after="120" w:line="360"/>
-        <w:jc w:val="left"/>
-      </w:pPr>
-      <w:r>
-        <w:rPr>
-          <w:rFonts w:ascii="Times New Roman" w:cs="Times New Roman" w:eastAsia="Times New Roman" w:hAnsi="Times New Roman"/>
-          <w:b w:val="false"/>
-          <w:bCs w:val="false"/>
-          <w:sz w:val="24"/>
-          <w:szCs w:val="24"/>
-        </w:rPr>
-        <w:t xml:space="preserve">Luis Anunciação</w:t>
       </w:r>
     </w:p>
     <w:sectPr>

</xml_diff>